<commit_message>
Update progress doc rubric: add attendance, participation, and GitHub expectations to grade 3
</commit_message>
<xml_diff>
--- a/templates/progress-doc.docx
+++ b/templates/progress-doc.docx
@@ -333,6 +333,12 @@
               <w:t xml:space="preserve"> via slack.</w:t>
             </w:r>
           </w:p>
+          <w:p>
+            <w:pPr/>
+            <w:r>
+              <w:t>Student is not attending meetings on time, is not contributing their fair share of the work, is not putting code into GitHub, or is otherwise not meeting expectations for effort and participation.</w:t>
+            </w:r>
+          </w:p>
         </w:tc>
       </w:tr>
       <w:tr>
@@ -422,7 +428,7 @@
           </w:tcPr>
           <w:p>
             <w:r>
-              <w:t>Incomplete and demonstrates a lack of effort</w:t>
+              <w:t>Incomplete and demonstrates a lack of effort.</w:t>
             </w:r>
           </w:p>
         </w:tc>

</xml_diff>